<commit_message>
vault backup: 2026-07-26 10:55:04
</commit_message>
<xml_diff>
--- a/Kỹ thuật Phục hồi chức năng/01. Môn học Cơ sở (II.1)/MH09. Hóa sinh/Đề cương /2. LIPID.docx
+++ b/Kỹ thuật Phục hồi chức năng/01. Môn học Cơ sở (II.1)/MH09. Hóa sinh/Đề cương /2. LIPID.docx
@@ -2323,23 +2323,25 @@
         <w:spacing/>
         <w:ind w:firstLine="0"/>
         <w:rPr>
-          <w:szCs w:val="28"/>
-          <w:lang w:val="en-US"/>
+          <w:color w:val="c00000"/>
+          <w:szCs w:val="28"/>
         </w:rPr>
       </w:pPr>
       <w:r>
         <w:rPr>
           <w:b/>
           <w:bCs/>
-          <w:szCs w:val="28"/>
-          <w:lang w:val="en-US"/>
-        </w:rPr>
-        <w:t xml:space="preserve">Câu </w:t>
+          <w:color w:val="c00000"/>
+          <w:szCs w:val="28"/>
+          <w:lang w:val="en-US"/>
+        </w:rPr>
+        <w:t xml:space="preserve">*Câu </w:t>
       </w:r>
       <w:r>
         <w:rPr>
           <w:b/>
           <w:bCs/>
+          <w:color w:val="c00000"/>
           <w:szCs w:val="28"/>
           <w:lang w:val="en-US"/>
         </w:rPr>
@@ -2349,6 +2351,7 @@
         <w:rPr>
           <w:b/>
           <w:bCs/>
+          <w:color w:val="c00000"/>
           <w:szCs w:val="28"/>
           <w:lang w:val="en-US"/>
         </w:rPr>
@@ -2356,6 +2359,7 @@
       </w:r>
       <w:r>
         <w:rPr>
+          <w:color w:val="c00000"/>
           <w:szCs w:val="28"/>
           <w:lang w:val="en-US"/>
         </w:rPr>
@@ -2363,6 +2367,7 @@
       </w:r>
       <w:r>
         <w:rPr>
+          <w:color w:val="c00000"/>
           <w:szCs w:val="28"/>
           <w:lang w:val="en-US"/>
         </w:rPr>
@@ -5348,13 +5353,14 @@
         <w:spacing/>
         <w:ind w:firstLine="0"/>
         <w:rPr>
-          <w:szCs w:val="28"/>
-          <w:lang w:val="en-US"/>
+          <w:color w:val="c00000"/>
+          <w:szCs w:val="28"/>
         </w:rPr>
       </w:pPr>
       <w:r>
         <w:rPr>
           <w:b/>
+          <w:color w:val="c00000"/>
           <w:szCs w:val="28"/>
           <w:lang w:val="en-US"/>
         </w:rPr>
@@ -5363,6 +5369,7 @@
       <w:r>
         <w:rPr>
           <w:b/>
+          <w:color w:val="c00000"/>
           <w:szCs w:val="28"/>
           <w:lang w:val="en-US"/>
         </w:rPr>
@@ -5371,6 +5378,7 @@
       <w:r>
         <w:rPr>
           <w:b/>
+          <w:color w:val="c00000"/>
           <w:szCs w:val="28"/>
           <w:lang w:val="en-US"/>
         </w:rPr>
@@ -5378,6 +5386,7 @@
       </w:r>
       <w:r>
         <w:rPr>
+          <w:color w:val="c00000"/>
           <w:szCs w:val="28"/>
           <w:lang w:val="en-US"/>
         </w:rPr>
@@ -5385,6 +5394,7 @@
       </w:r>
       <w:r>
         <w:rPr>
+          <w:color w:val="c00000"/>
           <w:szCs w:val="28"/>
           <w:lang w:val="en-US"/>
         </w:rPr>
@@ -5404,26 +5414,36 @@
         <w:ind w:firstLine="0"/>
         <w:rPr>
           <w:szCs w:val="28"/>
-          <w:lang w:val="en-US"/>
-        </w:rPr>
-      </w:pPr>
-      <w:r>
-        <w:rPr>
-          <w:szCs w:val="28"/>
+          <w:highlight w:val="none"/>
+        </w:rPr>
+      </w:pPr>
+      <w:r>
+        <w:rPr>
+          <w:szCs w:val="28"/>
+          <w:highlight w:val="none"/>
           <w:lang w:val="en-US"/>
         </w:rPr>
         <w:tab/>
+      </w:r>
+      <w:r>
+        <w:rPr>
+          <w:szCs w:val="28"/>
+          <w:highlight w:val="none"/>
+          <w:lang w:val="en-US"/>
+        </w:rPr>
         <w:t xml:space="preserve">A. A</w:t>
       </w:r>
       <w:r>
         <w:rPr>
           <w:szCs w:val="28"/>
+          <w:highlight w:val="none"/>
         </w:rPr>
         <w:t xml:space="preserve">cid béo ngoài nhóm chức acid còn chứa</w:t>
       </w:r>
       <w:r>
         <w:rPr>
           <w:szCs w:val="28"/>
+          <w:highlight w:val="none"/>
           <w:lang w:val="en-US"/>
         </w:rPr>
         <w:t xml:space="preserve"> </w:t>
@@ -5431,18 +5451,21 @@
       <w:r>
         <w:rPr>
           <w:szCs w:val="28"/>
+          <w:highlight w:val="none"/>
         </w:rPr>
         <w:t xml:space="preserve">những nhóm chức khác như rượ</w:t>
       </w:r>
       <w:r>
         <w:rPr>
           <w:szCs w:val="28"/>
+          <w:highlight w:val="none"/>
         </w:rPr>
         <w:t xml:space="preserve">u, ketone</w:t>
       </w:r>
       <w:r>
         <w:rPr>
           <w:szCs w:val="28"/>
+          <w:highlight w:val="none"/>
           <w:lang w:val="en-US"/>
         </w:rPr>
         <w:t xml:space="preserve">.</w:t>
@@ -5450,6 +5473,7 @@
       <w:r>
         <w:rPr>
           <w:szCs w:val="28"/>
+          <w:highlight w:val="none"/>
           <w:lang w:val="en-US"/>
         </w:rPr>
       </w:r>
@@ -5469,13 +5493,13 @@
         <w:rPr>
           <w:iCs/>
           <w:szCs w:val="28"/>
-          <w:highlight w:val="yellow"/>
-        </w:rPr>
-      </w:pPr>
-      <w:r>
-        <w:rPr>
-          <w:szCs w:val="28"/>
-          <w:highlight w:val="yellow"/>
+          <w:highlight w:val="none"/>
+        </w:rPr>
+      </w:pPr>
+      <w:r>
+        <w:rPr>
+          <w:szCs w:val="28"/>
+          <w:highlight w:val="none"/>
           <w:lang w:val="en-US"/>
         </w:rPr>
         <w:tab/>
@@ -5485,7 +5509,7 @@
         <w:rPr>
           <w:iCs/>
           <w:szCs w:val="28"/>
-          <w:highlight w:val="yellow"/>
+          <w:highlight w:val="none"/>
         </w:rPr>
         <w:t xml:space="preserve">Glycerophospholipid</w:t>
       </w:r>
@@ -5493,7 +5517,7 @@
         <w:rPr>
           <w:iCs/>
           <w:szCs w:val="28"/>
-          <w:highlight w:val="yellow"/>
+          <w:highlight w:val="none"/>
           <w:lang w:val="en-US"/>
         </w:rPr>
         <w:t xml:space="preserve"> có tính lưỡng cực, đảm bảo tính bán thấm cho các cấu trúc tế nào</w:t>
@@ -5502,7 +5526,7 @@
         <w:rPr>
           <w:iCs/>
           <w:szCs w:val="28"/>
-          <w:highlight w:val="yellow"/>
+          <w:highlight w:val="none"/>
           <w:lang w:val="en-US"/>
         </w:rPr>
       </w:r>
@@ -5621,13 +5645,14 @@
         <w:rPr>
           <w:iCs/>
           <w:szCs w:val="28"/>
-          <w:lang w:val="en-US"/>
+          <w:highlight w:val="green"/>
         </w:rPr>
       </w:pPr>
       <w:r>
         <w:rPr>
           <w:iCs/>
           <w:szCs w:val="28"/>
+          <w:highlight w:val="green"/>
           <w:lang w:val="en-US"/>
         </w:rPr>
         <w:t xml:space="preserve">E. Tất cả đều đúng</w:t>
@@ -5636,6 +5661,7 @@
         <w:rPr>
           <w:iCs/>
           <w:szCs w:val="28"/>
+          <w:highlight w:val="green"/>
           <w:lang w:val="en-US"/>
         </w:rPr>
       </w:r>
@@ -6688,6 +6714,61 @@
     </w:p>
     <w:p>
       <w:pPr>
+        <w:pBdr>
+          <w:top w:val="none" w:color="000000" w:sz="4" w:space="0"/>
+          <w:left w:val="none" w:color="000000" w:sz="4" w:space="0"/>
+          <w:bottom w:val="none" w:color="000000" w:sz="4" w:space="0"/>
+          <w:right w:val="none" w:color="000000" w:sz="4" w:space="0"/>
+        </w:pBdr>
+        <w:spacing w:after="0" w:before="0"/>
+        <w:ind w:right="0" w:firstLine="0" w:left="0"/>
+        <w:rPr>
+          <w:highlight w:val="yellow"/>
+        </w:rPr>
+      </w:pPr>
+      <w:r>
+        <w:rPr>
+          <w:szCs w:val="28"/>
+          <w:highlight w:val="yellow"/>
+          <w:lang w:val="en-US"/>
+        </w:rPr>
+        <w:tab/>
+        <w:t xml:space="preserve">B. </w:t>
+      </w:r>
+      <w:r>
+        <w:rPr>
+          <w:iCs/>
+          <w:szCs w:val="28"/>
+          <w:highlight w:val="yellow"/>
+        </w:rPr>
+        <w:t xml:space="preserve">Glycerophospholipid</w:t>
+      </w:r>
+      <w:r>
+        <w:rPr>
+          <w:iCs/>
+          <w:szCs w:val="28"/>
+          <w:highlight w:val="yellow"/>
+          <w:lang w:val="en-US"/>
+        </w:rPr>
+        <w:t xml:space="preserve"> có tính lưỡng cực, đảm bảo tính bán thấm cho các cấu trúc tế nào </w:t>
+      </w:r>
+      <w:r>
+        <w:rPr>
+          <w:rFonts w:ascii="Times New Roman" w:hAnsi="Times New Roman" w:eastAsia="Times New Roman" w:cs="Times New Roman"/>
+          <w:color w:val="000000"/>
+          <w:sz w:val="24"/>
+          <w:highlight w:val="yellow"/>
+        </w:rPr>
+        <w:t xml:space="preserve">càng</w:t>
+      </w:r>
+      <w:r>
+        <w:rPr>
+          <w:highlight w:val="yellow"/>
+        </w:rPr>
+      </w:r>
+    </w:p>
+    <w:p>
+      <w:pPr>
         <w:pBdr/>
         <w:tabs>
           <w:tab w:val="left" w:leader="none" w:pos="360"/>
@@ -6699,41 +6780,24 @@
         <w:spacing/>
         <w:ind w:firstLine="0"/>
         <w:rPr>
+          <w:lang w:val="en-US"/>
+        </w:rPr>
+      </w:pPr>
+      <w:r>
+        <w:rPr>
           <w:iCs/>
           <w:szCs w:val="28"/>
           <w:lang w:val="en-US"/>
         </w:rPr>
-      </w:pPr>
-      <w:r>
-        <w:rPr>
-          <w:szCs w:val="28"/>
-          <w:lang w:val="en-US"/>
-        </w:rPr>
-        <w:tab/>
-        <w:t xml:space="preserve">B. </w:t>
       </w:r>
       <w:r>
         <w:rPr>
           <w:iCs/>
           <w:szCs w:val="28"/>
-        </w:rPr>
-        <w:t xml:space="preserve">Glycerophospholipid</w:t>
-      </w:r>
-      <w:r>
-        <w:rPr>
-          <w:iCs/>
-          <w:szCs w:val="28"/>
-          <w:lang w:val="en-US"/>
-        </w:rPr>
-        <w:t xml:space="preserve"> có tính lưỡng cực, đảm bảo tính bán thấm cho các cấu trúc tế nào</w:t>
-      </w:r>
-      <w:r>
-        <w:rPr>
-          <w:iCs/>
-          <w:szCs w:val="28"/>
-          <w:lang w:val="en-US"/>
-        </w:rPr>
-      </w:r>
+          <w:lang w:val="en-US"/>
+        </w:rPr>
+      </w:r>
+      <w:r/>
     </w:p>
     <w:p>
       <w:pPr>
@@ -7115,6 +7179,13 @@
           <w:lang w:val="en-US"/>
         </w:rPr>
         <w:tab/>
+      </w:r>
+      <w:r>
+        <w:rPr>
+          <w:szCs w:val="28"/>
+          <w:highlight w:val="yellow"/>
+          <w:lang w:val="en-US"/>
+        </w:rPr>
         <w:t xml:space="preserve">E. Tất cả đều đúng</w:t>
       </w:r>
       <w:r>
@@ -7308,6 +7379,13 @@
           <w:lang w:val="en-US"/>
         </w:rPr>
         <w:tab/>
+      </w:r>
+      <w:r>
+        <w:rPr>
+          <w:szCs w:val="28"/>
+          <w:highlight w:val="yellow"/>
+          <w:lang w:val="en-US"/>
+        </w:rPr>
         <w:t xml:space="preserve">D. Sản phẩm chuyển hóa đi vào Krebs và chuỗi hô hấp tề bào</w:t>
       </w:r>
       <w:r>
@@ -7442,12 +7520,20 @@
           <w:lang w:val="en-US"/>
         </w:rPr>
         <w:tab/>
+      </w:r>
+      <w:r>
+        <w:rPr>
+          <w:szCs w:val="28"/>
+          <w:highlight w:val="yellow"/>
+          <w:lang w:val="en-US"/>
+        </w:rPr>
         <w:t xml:space="preserve">B. </w:t>
       </w:r>
       <w:r>
         <w:rPr>
           <w:rFonts w:cs="Times New Roman"/>
           <w:szCs w:val="28"/>
+          <w:highlight w:val="yellow"/>
           <w:lang w:val="en-US"/>
         </w:rPr>
         <w:t xml:space="preserve">β</w:t>
@@ -7656,13 +7742,14 @@
         <w:rPr>
           <w:rFonts w:cs="Times New Roman"/>
           <w:szCs w:val="28"/>
-          <w:lang w:val="en-US"/>
+          <w:highlight w:val="yellow"/>
         </w:rPr>
       </w:pPr>
       <w:r>
         <w:rPr>
           <w:rFonts w:cs="Times New Roman"/>
           <w:szCs w:val="28"/>
+          <w:highlight w:val="yellow"/>
           <w:lang w:val="en-US"/>
         </w:rPr>
         <w:tab/>
@@ -7670,6 +7757,7 @@
       <w:r>
         <w:rPr>
           <w:szCs w:val="28"/>
+          <w:highlight w:val="yellow"/>
           <w:lang w:val="en-US"/>
         </w:rPr>
         <w:t xml:space="preserve">B. C</w:t>
@@ -7677,12 +7765,14 @@
       <w:r>
         <w:rPr>
           <w:szCs w:val="28"/>
+          <w:highlight w:val="yellow"/>
         </w:rPr>
         <w:t xml:space="preserve">ắt dần </w:t>
       </w:r>
       <w:r>
         <w:rPr>
           <w:szCs w:val="28"/>
+          <w:highlight w:val="yellow"/>
           <w:lang w:val="en-US"/>
         </w:rPr>
         <w:t xml:space="preserve">từng </w:t>
@@ -7690,12 +7780,14 @@
       <w:r>
         <w:rPr>
           <w:szCs w:val="28"/>
+          <w:highlight w:val="yellow"/>
         </w:rPr>
         <w:t xml:space="preserve">C và tạo ra CO</w:t>
       </w:r>
       <w:r>
         <w:rPr>
           <w:szCs w:val="28"/>
+          <w:highlight w:val="yellow"/>
           <w:vertAlign w:val="subscript"/>
         </w:rPr>
         <w:t xml:space="preserve">2</w:t>
@@ -7703,6 +7795,7 @@
       <w:r>
         <w:rPr>
           <w:szCs w:val="28"/>
+          <w:highlight w:val="yellow"/>
         </w:rPr>
         <w:t xml:space="preserve">.</w:t>
       </w:r>
@@ -7710,6 +7803,7 @@
         <w:rPr>
           <w:rFonts w:cs="Times New Roman"/>
           <w:szCs w:val="28"/>
+          <w:highlight w:val="yellow"/>
           <w:lang w:val="en-US"/>
         </w:rPr>
       </w:r>
@@ -8084,13 +8178,14 @@
         <w:rPr>
           <w:rFonts w:cs="Times New Roman"/>
           <w:szCs w:val="28"/>
-          <w:lang w:val="en-US"/>
+          <w:highlight w:val="yellow"/>
         </w:rPr>
       </w:pPr>
       <w:r>
         <w:rPr>
           <w:rFonts w:cs="Times New Roman"/>
           <w:szCs w:val="28"/>
+          <w:highlight w:val="yellow"/>
           <w:lang w:val="en-US"/>
         </w:rPr>
         <w:tab/>
@@ -8100,6 +8195,7 @@
         <w:rPr>
           <w:rFonts w:cs="Times New Roman"/>
           <w:szCs w:val="28"/>
+          <w:highlight w:val="yellow"/>
           <w:lang w:val="en-US"/>
         </w:rPr>
       </w:r>
@@ -8502,6 +8598,13 @@
           <w:lang w:val="en-US"/>
         </w:rPr>
         <w:tab/>
+      </w:r>
+      <w:r>
+        <w:rPr>
+          <w:szCs w:val="28"/>
+          <w:highlight w:val="yellow"/>
+          <w:lang w:val="en-US"/>
+        </w:rPr>
         <w:t xml:space="preserve">D. Tất cả đều đúng</w:t>
       </w:r>
       <w:r>
@@ -8872,7 +8975,7 @@
         <w:jc w:val="left"/>
         <w:rPr>
           <w:szCs w:val="28"/>
-          <w:lang w:val="en-US"/>
+          <w:highlight w:val="yellow"/>
         </w:rPr>
       </w:pPr>
       <w:r>
@@ -8881,11 +8984,19 @@
           <w:lang w:val="en-US"/>
         </w:rPr>
         <w:tab/>
+      </w:r>
+      <w:r>
+        <w:rPr>
+          <w:szCs w:val="28"/>
+          <w:highlight w:val="yellow"/>
+          <w:lang w:val="en-US"/>
+        </w:rPr>
         <w:t xml:space="preserve">C. Acid béo có nC sẽ tạo ra</w:t>
       </w:r>
       <w:r>
         <w:rPr>
           <w:szCs w:val="28"/>
+          <w:highlight w:val="yellow"/>
           <w:lang w:val="en-US"/>
         </w:rPr>
       </w:r>
@@ -8949,6 +9060,13 @@
           <w:lang w:val="en-US"/>
         </w:rPr>
         <w:tab/>
+      </w:r>
+      <w:r>
+        <w:rPr>
+          <w:szCs w:val="28"/>
+          <w:highlight w:val="none"/>
+          <w:lang w:val="en-US"/>
+        </w:rPr>
         <w:t xml:space="preserve">E. Tất cả đều sai</w:t>
       </w:r>
       <w:r>
@@ -9047,6 +9165,14 @@
           <w:lang w:val="en-US"/>
         </w:rPr>
         <w:tab/>
+      </w:r>
+      <w:r>
+        <w:rPr>
+          <w:rFonts w:cs="Times New Roman"/>
+          <w:szCs w:val="28"/>
+          <w:highlight w:val="none"/>
+          <w:lang w:val="en-US"/>
+        </w:rPr>
         <w:t xml:space="preserve">A. 108</w:t>
       </w:r>
       <w:r>
@@ -9065,6 +9191,14 @@
           <w:lang w:val="en-US"/>
         </w:rPr>
         <w:tab/>
+      </w:r>
+      <w:r>
+        <w:rPr>
+          <w:rFonts w:cs="Times New Roman"/>
+          <w:szCs w:val="28"/>
+          <w:highlight w:val="yellow"/>
+          <w:lang w:val="en-US"/>
+        </w:rPr>
         <w:t xml:space="preserve">C. 113</w:t>
       </w:r>
       <w:r>
@@ -9225,6 +9359,14 @@
           <w:lang w:val="en-US"/>
         </w:rPr>
         <w:tab/>
+      </w:r>
+      <w:r>
+        <w:rPr>
+          <w:rFonts w:cs="Times New Roman"/>
+          <w:szCs w:val="28"/>
+          <w:highlight w:val="yellow"/>
+          <w:lang w:val="en-US"/>
+        </w:rPr>
         <w:t xml:space="preserve">E. 130</w:t>
       </w:r>
       <w:r>
@@ -9437,6 +9579,13 @@
           <w:lang w:val="en-US"/>
         </w:rPr>
         <w:tab/>
+      </w:r>
+      <w:r>
+        <w:rPr>
+          <w:szCs w:val="28"/>
+          <w:highlight w:val="yellow"/>
+          <w:lang w:val="en-US"/>
+        </w:rPr>
         <w:t xml:space="preserve">D. Tất cả đều đúng</w:t>
       </w:r>
       <w:r>
@@ -9562,6 +9711,13 @@
           <w:lang w:val="en-US"/>
         </w:rPr>
         <w:tab/>
+      </w:r>
+      <w:r>
+        <w:rPr>
+          <w:szCs w:val="28"/>
+          <w:highlight w:val="yellow"/>
+          <w:lang w:val="en-US"/>
+        </w:rPr>
         <w:t xml:space="preserve">A. Lipase thủy phân Cerid thành Glycerin và Acid béo</w:t>
       </w:r>
       <w:r>
@@ -9698,17 +9854,26 @@
           <w:lang w:val="en-US"/>
         </w:rPr>
         <w:tab/>
+      </w:r>
+      <w:r>
+        <w:rPr>
+          <w:szCs w:val="28"/>
+          <w:highlight w:val="white"/>
+          <w:lang w:val="en-US"/>
+        </w:rPr>
         <w:t xml:space="preserve">E. Tổng hợp Glycerin </w:t>
       </w:r>
       <w:r>
         <w:rPr>
           <w:szCs w:val="28"/>
+          <w:highlight w:val="white"/>
         </w:rPr>
         <w:t xml:space="preserve">ngược lại với</w:t>
       </w:r>
       <w:r>
         <w:rPr>
           <w:szCs w:val="28"/>
+          <w:highlight w:val="white"/>
           <w:lang w:val="en-US"/>
         </w:rPr>
         <w:t xml:space="preserve"> quá trình</w:t>
@@ -9716,8 +9881,16 @@
       <w:r>
         <w:rPr>
           <w:szCs w:val="28"/>
-        </w:rPr>
-        <w:t xml:space="preserve"> phân giải </w:t>
+          <w:highlight w:val="white"/>
+        </w:rPr>
+        <w:t xml:space="preserve"> phân giải</w:t>
+      </w:r>
+      <w:r>
+        <w:rPr>
+          <w:szCs w:val="28"/>
+          <w:highlight w:val="yellow"/>
+        </w:rPr>
+        <w:t xml:space="preserve"> </w:t>
       </w:r>
       <w:r>
         <w:rPr>
@@ -9739,21 +9912,23 @@
         <w:spacing/>
         <w:ind w:firstLine="0"/>
         <w:rPr>
-          <w:szCs w:val="28"/>
-          <w:lang w:val="en-US"/>
+          <w:color w:val="c00000"/>
+          <w:szCs w:val="28"/>
         </w:rPr>
       </w:pPr>
       <w:r>
         <w:rPr>
           <w:b/>
-          <w:szCs w:val="28"/>
-          <w:lang w:val="en-US"/>
-        </w:rPr>
-        <w:t xml:space="preserve">Câu </w:t>
+          <w:color w:val="c00000"/>
+          <w:szCs w:val="28"/>
+          <w:lang w:val="en-US"/>
+        </w:rPr>
+        <w:t xml:space="preserve">*Câu </w:t>
       </w:r>
       <w:r>
         <w:rPr>
           <w:b/>
+          <w:color w:val="c00000"/>
           <w:szCs w:val="28"/>
           <w:lang w:val="en-US"/>
         </w:rPr>
@@ -9762,6 +9937,7 @@
       <w:r>
         <w:rPr>
           <w:b/>
+          <w:color w:val="c00000"/>
           <w:szCs w:val="28"/>
           <w:lang w:val="en-US"/>
         </w:rPr>
@@ -9769,6 +9945,7 @@
       </w:r>
       <w:r>
         <w:rPr>
+          <w:color w:val="c00000"/>
           <w:szCs w:val="28"/>
           <w:lang w:val="en-US"/>
         </w:rPr>
@@ -9776,6 +9953,7 @@
       </w:r>
       <w:r>
         <w:rPr>
+          <w:color w:val="c00000"/>
           <w:szCs w:val="28"/>
           <w:lang w:val="en-US"/>
         </w:rPr>
@@ -9806,17 +9984,26 @@
           <w:lang w:val="en-US"/>
         </w:rPr>
         <w:tab/>
+      </w:r>
+      <w:r>
+        <w:rPr>
+          <w:szCs w:val="28"/>
+          <w:highlight w:val="none"/>
+          <w:lang w:val="en-US"/>
+        </w:rPr>
         <w:t xml:space="preserve">A. Tổng hợp Glycerin </w:t>
       </w:r>
       <w:r>
         <w:rPr>
           <w:szCs w:val="28"/>
+          <w:highlight w:val="none"/>
         </w:rPr>
         <w:t xml:space="preserve">ngược lại với</w:t>
       </w:r>
       <w:r>
         <w:rPr>
           <w:szCs w:val="28"/>
+          <w:highlight w:val="none"/>
           <w:lang w:val="en-US"/>
         </w:rPr>
         <w:t xml:space="preserve"> quá trình</w:t>
@@ -9824,6 +10011,7 @@
       <w:r>
         <w:rPr>
           <w:szCs w:val="28"/>
+          <w:highlight w:val="none"/>
         </w:rPr>
         <w:t xml:space="preserve"> phân giải </w:t>
       </w:r>
@@ -9848,7 +10036,7 @@
         <w:ind w:firstLine="0"/>
         <w:rPr>
           <w:szCs w:val="28"/>
-          <w:lang w:val="en-US"/>
+          <w:highlight w:val="green"/>
         </w:rPr>
       </w:pPr>
       <w:r>
@@ -9857,17 +10045,26 @@
           <w:lang w:val="en-US"/>
         </w:rPr>
         <w:tab/>
+      </w:r>
+      <w:r>
+        <w:rPr>
+          <w:szCs w:val="28"/>
+          <w:highlight w:val="white"/>
+          <w:lang w:val="en-US"/>
+        </w:rPr>
         <w:t xml:space="preserve">B. </w:t>
       </w:r>
       <w:r>
         <w:rPr>
           <w:szCs w:val="28"/>
+          <w:highlight w:val="white"/>
         </w:rPr>
         <w:t xml:space="preserve">Acid béo được tổng hợp từ acetyl-CoA, xảy ra ngược với quá trình </w:t>
       </w:r>
       <w:r>
         <w:rPr>
           <w:szCs w:val="28"/>
+          <w:highlight w:val="white"/>
           <w:lang w:val="el-GR"/>
         </w:rPr>
         <w:t xml:space="preserve">β</w:t>
@@ -9875,12 +10072,14 @@
       <w:r>
         <w:rPr>
           <w:szCs w:val="28"/>
+          <w:highlight w:val="white"/>
         </w:rPr>
         <w:t xml:space="preserve"> oxi hóa.</w:t>
       </w:r>
       <w:r>
         <w:rPr>
           <w:szCs w:val="28"/>
+          <w:highlight w:val="green"/>
           <w:lang w:val="en-US"/>
         </w:rPr>
       </w:r>
@@ -9946,6 +10145,13 @@
           <w:lang w:val="en-US"/>
         </w:rPr>
         <w:tab/>
+      </w:r>
+      <w:r>
+        <w:rPr>
+          <w:szCs w:val="28"/>
+          <w:highlight w:val="green"/>
+          <w:lang w:val="en-US"/>
+        </w:rPr>
         <w:t xml:space="preserve">D. Tất cả đều đúng</w:t>
       </w:r>
       <w:r>
@@ -9969,12 +10175,13 @@
         <w:ind w:firstLine="0"/>
         <w:rPr>
           <w:szCs w:val="28"/>
-          <w:lang w:val="en-US"/>
-        </w:rPr>
-      </w:pPr>
-      <w:r>
-        <w:rPr>
-          <w:szCs w:val="28"/>
+          <w:highlight w:val="none"/>
+        </w:rPr>
+      </w:pPr>
+      <w:r>
+        <w:rPr>
+          <w:szCs w:val="28"/>
+          <w:highlight w:val="none"/>
           <w:lang w:val="en-US"/>
         </w:rPr>
         <w:tab/>
@@ -9983,6 +10190,7 @@
       <w:r>
         <w:rPr>
           <w:szCs w:val="28"/>
+          <w:highlight w:val="none"/>
           <w:lang w:val="en-US"/>
         </w:rPr>
       </w:r>
@@ -10058,26 +10266,36 @@
         <w:jc w:val="left"/>
         <w:rPr>
           <w:szCs w:val="28"/>
-          <w:lang w:val="en-US"/>
-        </w:rPr>
-      </w:pPr>
-      <w:r>
-        <w:rPr>
-          <w:szCs w:val="28"/>
+          <w:highlight w:val="none"/>
+        </w:rPr>
+      </w:pPr>
+      <w:r>
+        <w:rPr>
+          <w:szCs w:val="28"/>
+          <w:highlight w:val="none"/>
           <w:lang w:val="en-US"/>
         </w:rPr>
         <w:tab/>
+      </w:r>
+      <w:r>
+        <w:rPr>
+          <w:szCs w:val="28"/>
+          <w:highlight w:val="green"/>
+          <w:lang w:val="en-US"/>
+        </w:rPr>
         <w:t xml:space="preserve">A. Tổng hợp Glycerin </w:t>
       </w:r>
       <w:r>
         <w:rPr>
           <w:szCs w:val="28"/>
+          <w:highlight w:val="green"/>
         </w:rPr>
         <w:t xml:space="preserve">ngược lại với</w:t>
       </w:r>
       <w:r>
         <w:rPr>
           <w:szCs w:val="28"/>
+          <w:highlight w:val="green"/>
           <w:lang w:val="en-US"/>
         </w:rPr>
         <w:t xml:space="preserve"> quá trình</w:t>
@@ -10085,12 +10303,14 @@
       <w:r>
         <w:rPr>
           <w:szCs w:val="28"/>
+          <w:highlight w:val="green"/>
         </w:rPr>
         <w:t xml:space="preserve"> phân giải </w:t>
       </w:r>
       <w:r>
         <w:rPr>
           <w:szCs w:val="28"/>
+          <w:highlight w:val="none"/>
           <w:lang w:val="en-US"/>
         </w:rPr>
       </w:r>
@@ -10265,6 +10485,13 @@
           <w:lang w:val="en-US"/>
         </w:rPr>
         <w:tab/>
+      </w:r>
+      <w:r>
+        <w:rPr>
+          <w:szCs w:val="28"/>
+          <w:highlight w:val="none"/>
+          <w:lang w:val="en-US"/>
+        </w:rPr>
         <w:t xml:space="preserve">E. Tất cả đều sai</w:t>
       </w:r>
       <w:r>
@@ -10387,26 +10614,36 @@
         <w:jc w:val="left"/>
         <w:rPr>
           <w:szCs w:val="28"/>
-          <w:lang w:val="en-US"/>
-        </w:rPr>
-      </w:pPr>
-      <w:r>
-        <w:rPr>
-          <w:szCs w:val="28"/>
+          <w:highlight w:val="none"/>
+        </w:rPr>
+      </w:pPr>
+      <w:r>
+        <w:rPr>
+          <w:szCs w:val="28"/>
+          <w:highlight w:val="none"/>
           <w:lang w:val="en-US"/>
         </w:rPr>
         <w:tab/>
+      </w:r>
+      <w:r>
+        <w:rPr>
+          <w:szCs w:val="28"/>
+          <w:highlight w:val="yellow"/>
+          <w:lang w:val="en-US"/>
+        </w:rPr>
         <w:t xml:space="preserve">B. N</w:t>
       </w:r>
       <w:r>
         <w:rPr>
           <w:szCs w:val="28"/>
+          <w:highlight w:val="yellow"/>
         </w:rPr>
         <w:t xml:space="preserve">guồn nguyên liệu</w:t>
       </w:r>
       <w:r>
         <w:rPr>
           <w:szCs w:val="28"/>
+          <w:highlight w:val="yellow"/>
           <w:lang w:val="en-US"/>
         </w:rPr>
         <w:t xml:space="preserve"> tổng hợp Cholestorol</w:t>
@@ -10414,12 +10651,14 @@
       <w:r>
         <w:rPr>
           <w:szCs w:val="28"/>
+          <w:highlight w:val="yellow"/>
         </w:rPr>
         <w:t xml:space="preserve"> là </w:t>
       </w:r>
       <w:r>
         <w:rPr>
           <w:szCs w:val="28"/>
+          <w:highlight w:val="yellow"/>
           <w:lang w:val="en-US"/>
         </w:rPr>
         <w:t xml:space="preserve">Acyl</w:t>
@@ -10427,12 +10666,14 @@
       <w:r>
         <w:rPr>
           <w:szCs w:val="28"/>
+          <w:highlight w:val="yellow"/>
         </w:rPr>
         <w:t xml:space="preserve">-CoA</w:t>
       </w:r>
       <w:r>
         <w:rPr>
           <w:szCs w:val="28"/>
+          <w:highlight w:val="none"/>
           <w:lang w:val="en-US"/>
         </w:rPr>
       </w:r>
@@ -10553,20 +10794,29 @@
         <w:jc w:val="left"/>
         <w:rPr>
           <w:szCs w:val="28"/>
-          <w:lang w:val="en-US"/>
-        </w:rPr>
-      </w:pPr>
-      <w:r>
-        <w:rPr>
-          <w:szCs w:val="28"/>
+          <w:highlight w:val="none"/>
+        </w:rPr>
+      </w:pPr>
+      <w:r>
+        <w:rPr>
+          <w:szCs w:val="28"/>
+          <w:highlight w:val="none"/>
           <w:lang w:val="en-US"/>
         </w:rPr>
         <w:tab/>
+      </w:r>
+      <w:r>
+        <w:rPr>
+          <w:szCs w:val="28"/>
+          <w:highlight w:val="none"/>
+          <w:lang w:val="en-US"/>
+        </w:rPr>
         <w:t xml:space="preserve">E. Trong cơ thể, chủ yếu tồn tại dạng Cholesterol tự do</w:t>
       </w:r>
       <w:r>
         <w:rPr>
           <w:szCs w:val="28"/>
+          <w:highlight w:val="none"/>
           <w:lang w:val="en-US"/>
         </w:rPr>
       </w:r>
@@ -10744,12 +10994,13 @@
         <w:jc w:val="left"/>
         <w:rPr>
           <w:szCs w:val="28"/>
-          <w:lang w:val="en-US"/>
-        </w:rPr>
-      </w:pPr>
-      <w:r>
-        <w:rPr>
-          <w:szCs w:val="28"/>
+          <w:highlight w:val="yellow"/>
+        </w:rPr>
+      </w:pPr>
+      <w:r>
+        <w:rPr>
+          <w:szCs w:val="28"/>
+          <w:highlight w:val="yellow"/>
           <w:lang w:val="en-US"/>
         </w:rPr>
         <w:tab/>
@@ -10758,12 +11009,14 @@
       <w:r>
         <w:rPr>
           <w:szCs w:val="28"/>
+          <w:highlight w:val="yellow"/>
         </w:rPr>
         <w:t xml:space="preserve">hoái hóa cholesterol</w:t>
       </w:r>
       <w:r>
         <w:rPr>
           <w:szCs w:val="28"/>
+          <w:highlight w:val="yellow"/>
           <w:lang w:val="en-US"/>
         </w:rPr>
         <w:t xml:space="preserve"> </w:t>
@@ -10771,12 +11024,14 @@
       <w:r>
         <w:rPr>
           <w:szCs w:val="28"/>
+          <w:highlight w:val="yellow"/>
         </w:rPr>
         <w:t xml:space="preserve">tạo thành </w:t>
       </w:r>
       <w:r>
         <w:rPr>
           <w:szCs w:val="28"/>
+          <w:highlight w:val="yellow"/>
           <w:lang w:val="en-US"/>
         </w:rPr>
         <w:t xml:space="preserve">sắc tố</w:t>
@@ -10784,12 +11039,14 @@
       <w:r>
         <w:rPr>
           <w:szCs w:val="28"/>
+          <w:highlight w:val="yellow"/>
         </w:rPr>
         <w:t xml:space="preserve"> mật. Quá trình này</w:t>
       </w:r>
       <w:r>
         <w:rPr>
           <w:szCs w:val="28"/>
+          <w:highlight w:val="yellow"/>
           <w:lang w:val="en-US"/>
         </w:rPr>
         <w:t xml:space="preserve"> </w:t>
@@ -10797,12 +11054,14 @@
       <w:r>
         <w:rPr>
           <w:szCs w:val="28"/>
+          <w:highlight w:val="yellow"/>
         </w:rPr>
         <w:t xml:space="preserve">xảy ra ở gan và ruột.</w:t>
       </w:r>
       <w:r>
         <w:rPr>
           <w:szCs w:val="28"/>
+          <w:highlight w:val="yellow"/>
           <w:lang w:val="en-US"/>
         </w:rPr>
       </w:r>
@@ -10857,20 +11116,29 @@
         <w:jc w:val="left"/>
         <w:rPr>
           <w:szCs w:val="28"/>
-          <w:lang w:val="en-US"/>
-        </w:rPr>
-      </w:pPr>
-      <w:r>
-        <w:rPr>
-          <w:szCs w:val="28"/>
+          <w:highlight w:val="none"/>
+        </w:rPr>
+      </w:pPr>
+      <w:r>
+        <w:rPr>
+          <w:szCs w:val="28"/>
+          <w:highlight w:val="none"/>
           <w:lang w:val="en-US"/>
         </w:rPr>
         <w:tab/>
+      </w:r>
+      <w:r>
+        <w:rPr>
+          <w:szCs w:val="28"/>
+          <w:highlight w:val="none"/>
+          <w:lang w:val="en-US"/>
+        </w:rPr>
         <w:t xml:space="preserve">E. Trong cơ thể, chủ yếu tồn tại dạng Cholesterol tự do</w:t>
       </w:r>
       <w:r>
         <w:rPr>
           <w:szCs w:val="28"/>
+          <w:highlight w:val="none"/>
           <w:lang w:val="en-US"/>
         </w:rPr>
       </w:r>
@@ -10890,13 +11158,14 @@
         <w:ind w:firstLine="0"/>
         <w:jc w:val="left"/>
         <w:rPr>
-          <w:szCs w:val="28"/>
-          <w:lang w:val="en-US"/>
+          <w:color w:val="c00000"/>
+          <w:szCs w:val="28"/>
         </w:rPr>
       </w:pPr>
       <w:r>
         <w:rPr>
           <w:b/>
+          <w:color w:val="c00000"/>
           <w:szCs w:val="28"/>
           <w:lang w:val="en-US"/>
         </w:rPr>
@@ -10905,6 +11174,7 @@
       <w:r>
         <w:rPr>
           <w:b/>
+          <w:color w:val="c00000"/>
           <w:szCs w:val="28"/>
           <w:lang w:val="en-US"/>
         </w:rPr>
@@ -10913,6 +11183,7 @@
       <w:r>
         <w:rPr>
           <w:b/>
+          <w:color w:val="c00000"/>
           <w:szCs w:val="28"/>
           <w:lang w:val="en-US"/>
         </w:rPr>
@@ -10920,6 +11191,7 @@
       </w:r>
       <w:r>
         <w:rPr>
+          <w:color w:val="c00000"/>
           <w:szCs w:val="28"/>
           <w:lang w:val="en-US"/>
         </w:rPr>
@@ -10927,6 +11199,7 @@
       </w:r>
       <w:r>
         <w:rPr>
+          <w:color w:val="c00000"/>
           <w:szCs w:val="28"/>
           <w:lang w:val="en-US"/>
         </w:rPr>
@@ -11113,7 +11386,7 @@
         <w:ind w:firstLine="0"/>
         <w:jc w:val="left"/>
         <w:rPr>
-          <w:szCs w:val="28"/>
+          <w:highlight w:val="none"/>
           <w:lang w:val="en-US"/>
         </w:rPr>
       </w:pPr>
@@ -11127,7 +11400,7 @@
       </w:r>
       <w:r>
         <w:rPr>
-          <w:szCs w:val="28"/>
+          <w:highlight w:val="none"/>
           <w:lang w:val="en-US"/>
         </w:rPr>
       </w:r>
@@ -11147,28 +11420,28 @@
         <w:ind w:firstLine="0"/>
         <w:jc w:val="left"/>
         <w:rPr>
-          <w:szCs w:val="28"/>
-          <w:lang w:val="en-US"/>
-        </w:rPr>
-      </w:pPr>
-      <w:r>
-        <w:rPr>
-          <w:szCs w:val="28"/>
-          <w:lang w:val="en-US"/>
-        </w:rPr>
-        <w:tab/>
-        <w:t xml:space="preserve">E. Trong cơ thể, chủ yếu tồn tại dạng Cholesterol ester</w:t>
-      </w:r>
-      <w:r>
-        <w:rPr>
-          <w:szCs w:val="28"/>
-          <w:lang w:val="en-US"/>
-        </w:rPr>
-        <w:t xml:space="preserve"> (Sterid)</w:t>
-      </w:r>
-      <w:r>
-        <w:rPr>
-          <w:szCs w:val="28"/>
+          <w:highlight w:val="green"/>
+        </w:rPr>
+      </w:pPr>
+      <w:r>
+        <w:rPr>
+          <w:szCs w:val="28"/>
+          <w:highlight w:val="green"/>
+          <w:lang w:val="en-US" w:bidi="en-US"/>
+        </w:rPr>
+        <w:t xml:space="preserve">E. Trong cơ thể chủ yếu tồn tại dạng Cholesterol ester (Sterid)</w:t>
+      </w:r>
+      <w:r>
+        <w:rPr>
+          <w:szCs w:val="28"/>
+          <w:highlight w:val="green"/>
+          <w:lang w:val="en-US" w:bidi="en-US"/>
+        </w:rPr>
+      </w:r>
+      <w:r>
+        <w:rPr>
+          <w:szCs w:val="28"/>
+          <w:highlight w:val="green"/>
           <w:lang w:val="en-US"/>
         </w:rPr>
       </w:r>
@@ -11188,44 +11461,36 @@
         <w:ind w:firstLine="0"/>
         <w:jc w:val="left"/>
         <w:rPr>
-          <w:szCs w:val="28"/>
-          <w:lang w:val="en-US"/>
-        </w:rPr>
-      </w:pPr>
-      <w:r>
-        <w:rPr>
-          <w:b/>
-          <w:szCs w:val="28"/>
-          <w:lang w:val="en-US"/>
-        </w:rPr>
-        <w:t xml:space="preserve">Câu </w:t>
-      </w:r>
-      <w:r>
-        <w:rPr>
-          <w:b/>
-          <w:szCs w:val="28"/>
-          <w:lang w:val="en-US"/>
-        </w:rPr>
-        <w:t xml:space="preserve">53</w:t>
-      </w:r>
-      <w:r>
-        <w:rPr>
-          <w:b/>
-          <w:szCs w:val="28"/>
-          <w:lang w:val="en-US"/>
-        </w:rPr>
-        <w:t xml:space="preserve">:</w:t>
-      </w:r>
-      <w:r>
-        <w:rPr>
-          <w:szCs w:val="28"/>
-          <w:lang w:val="en-US"/>
-        </w:rPr>
-        <w:t xml:space="preserve"> Hormon nào sau đây làm giảm tổng hợp và tăng cường thoái hóa Lipid</w:t>
-      </w:r>
-      <w:r>
-        <w:rPr>
-          <w:szCs w:val="28"/>
+          <w:lang w:val="en-US"/>
+        </w:rPr>
+      </w:pPr>
+      <w:r>
+        <w:rPr>
+          <w:szCs w:val="28"/>
+          <w:highlight w:val="none"/>
+          <w:lang w:val="en-US" w:bidi="en-US"/>
+        </w:rPr>
+      </w:r>
+      <w:r/>
+      <w:r>
+        <w:rPr>
+          <w:szCs w:val="28"/>
+          <w:highlight w:val="none"/>
+          <w:lang w:val="en-US" w:bidi="en-US"/>
+        </w:rPr>
+      </w:r>
+      <w:r/>
+      <w:r>
+        <w:rPr>
+          <w:szCs w:val="28"/>
+          <w:highlight w:val="none"/>
+          <w:lang w:val="en-US" w:bidi="en-US"/>
+        </w:rPr>
+      </w:r>
+      <w:r>
+        <w:rPr>
+          <w:szCs w:val="28"/>
+          <w:highlight w:val="none"/>
           <w:lang w:val="en-US"/>
         </w:rPr>
       </w:r>
@@ -11251,6 +11516,63 @@
       </w:pPr>
       <w:r>
         <w:rPr>
+          <w:b/>
+          <w:szCs w:val="28"/>
+          <w:lang w:val="en-US"/>
+        </w:rPr>
+        <w:t xml:space="preserve">Câu </w:t>
+      </w:r>
+      <w:r>
+        <w:rPr>
+          <w:b/>
+          <w:szCs w:val="28"/>
+          <w:lang w:val="en-US"/>
+        </w:rPr>
+        <w:t xml:space="preserve">53</w:t>
+      </w:r>
+      <w:r>
+        <w:rPr>
+          <w:b/>
+          <w:szCs w:val="28"/>
+          <w:lang w:val="en-US"/>
+        </w:rPr>
+        <w:t xml:space="preserve">:</w:t>
+      </w:r>
+      <w:r>
+        <w:rPr>
+          <w:szCs w:val="28"/>
+          <w:lang w:val="en-US"/>
+        </w:rPr>
+        <w:t xml:space="preserve"> Hormon nào sau đây làm giảm tổng hợp và tăng cường thoái hóa Lipid</w:t>
+      </w:r>
+      <w:r>
+        <w:rPr>
+          <w:szCs w:val="28"/>
+          <w:lang w:val="en-US"/>
+        </w:rPr>
+      </w:r>
+    </w:p>
+    <w:p>
+      <w:pPr>
+        <w:keepNext w:val="false"/>
+        <w:pBdr/>
+        <w:tabs>
+          <w:tab w:val="left" w:leader="none" w:pos="360"/>
+          <w:tab w:val="left" w:leader="none" w:pos="2160"/>
+          <w:tab w:val="left" w:leader="none" w:pos="3960"/>
+          <w:tab w:val="left" w:leader="none" w:pos="5760"/>
+          <w:tab w:val="left" w:leader="none" w:pos="7560"/>
+        </w:tabs>
+        <w:spacing/>
+        <w:ind w:firstLine="0"/>
+        <w:jc w:val="left"/>
+        <w:rPr>
+          <w:szCs w:val="28"/>
+          <w:lang w:val="en-US"/>
+        </w:rPr>
+      </w:pPr>
+      <w:r>
+        <w:rPr>
           <w:szCs w:val="28"/>
           <w:lang w:val="en-US"/>
         </w:rPr>
@@ -11263,6 +11585,13 @@
           <w:lang w:val="en-US"/>
         </w:rPr>
         <w:tab/>
+      </w:r>
+      <w:r>
+        <w:rPr>
+          <w:szCs w:val="28"/>
+          <w:highlight w:val="none"/>
+          <w:lang w:val="en-US"/>
+        </w:rPr>
         <w:t xml:space="preserve">B. Thyroxyn</w:t>
       </w:r>
       <w:r>
@@ -11300,6 +11629,13 @@
           <w:lang w:val="en-US"/>
         </w:rPr>
         <w:tab/>
+      </w:r>
+      <w:r>
+        <w:rPr>
+          <w:szCs w:val="28"/>
+          <w:highlight w:val="yellow"/>
+          <w:lang w:val="en-US"/>
+        </w:rPr>
         <w:t xml:space="preserve">E. Cortisol</w:t>
       </w:r>
       <w:r>

</xml_diff>